<commit_message>
docs: publish updated M1-M4 technical DOCX and PDF
</commit_message>
<xml_diff>
--- a/submission/Seoul_Bike_90point_technical.docx
+++ b/submission/Seoul_Bike_90point_technical.docx
@@ -2194,7 +2194,19 @@
         </m:r>
       </m:oMath>
       <w:r>
-        <w:t xml:space="preserve">이다. 실제 계산은 역행렬을 직접 구하지 않고 `numpy.linalg.lstsq`로 수행했다. 입력에 삼각함수가 들어 있어도 미지의 계수에 대해서는 선형이다.</w:t>
+        <w:t xml:space="preserve">이다. 실제 계산은 역행렬을 직접 구하지 않고</w:t>
+      </w:r>
+      <w:r>
+        <w:t xml:space="preserve"> </w:t>
+      </w:r>
+      <w:r>
+        <w:rPr>
+          <w:rStyle w:val="VerbatimChar"/>
+        </w:rPr>
+        <w:t xml:space="preserve">numpy.linalg.lstsq</w:t>
+      </w:r>
+      <w:r>
+        <w:t xml:space="preserve">로 수행했다. 입력에 삼각함수가 들어 있어도 미지의 계수에 대해서는 선형이다.</w:t>
       </w:r>
     </w:p>
     <w:bookmarkEnd w:id="27"/>
@@ -5327,51 +5339,174 @@
     </w:p>
     <w:p>
       <w:pPr>
-        <w:pStyle w:val="FirstParagraph"/>
+        <w:pStyle w:val="SourceCode"/>
       </w:pPr>
       <w:r>
-        <w:t xml:space="preserve">```bash</w:t>
+        <w:rPr>
+          <w:rStyle w:val="ExtensionTok"/>
+        </w:rPr>
+        <w:t xml:space="preserve">python</w:t>
       </w:r>
       <w:r>
+        <w:rPr>
+          <w:rStyle w:val="NormalTok"/>
+        </w:rPr>
         <w:t xml:space="preserve"> </w:t>
       </w:r>
       <w:r>
-        <w:t xml:space="preserve">python -m pip install -r requirements.txt</w:t>
+        <w:rPr>
+          <w:rStyle w:val="AttributeTok"/>
+        </w:rPr>
+        <w:t xml:space="preserve">-m</w:t>
       </w:r>
       <w:r>
+        <w:rPr>
+          <w:rStyle w:val="NormalTok"/>
+        </w:rPr>
+        <w:t xml:space="preserve"> pip install </w:t>
+      </w:r>
+      <w:r>
+        <w:rPr>
+          <w:rStyle w:val="AttributeTok"/>
+        </w:rPr>
+        <w:t xml:space="preserve">-r</w:t>
+      </w:r>
+      <w:r>
+        <w:rPr>
+          <w:rStyle w:val="NormalTok"/>
+        </w:rPr>
+        <w:t xml:space="preserve"> requirements.txt</w:t>
+      </w:r>
+      <w:r>
+        <w:br/>
+      </w:r>
+      <w:r>
+        <w:rPr>
+          <w:rStyle w:val="ExtensionTok"/>
+        </w:rPr>
+        <w:t xml:space="preserve">python</w:t>
+      </w:r>
+      <w:r>
+        <w:rPr>
+          <w:rStyle w:val="NormalTok"/>
+        </w:rPr>
         <w:t xml:space="preserve"> </w:t>
       </w:r>
       <w:r>
-        <w:t xml:space="preserve">python -m src.run_analysis</w:t>
+        <w:rPr>
+          <w:rStyle w:val="AttributeTok"/>
+        </w:rPr>
+        <w:t xml:space="preserve">-m</w:t>
       </w:r>
       <w:r>
+        <w:rPr>
+          <w:rStyle w:val="NormalTok"/>
+        </w:rPr>
+        <w:t xml:space="preserve"> src.run_analysis</w:t>
+      </w:r>
+      <w:r>
+        <w:br/>
+      </w:r>
+      <w:r>
+        <w:rPr>
+          <w:rStyle w:val="ExtensionTok"/>
+        </w:rPr>
+        <w:t xml:space="preserve">python</w:t>
+      </w:r>
+      <w:r>
+        <w:rPr>
+          <w:rStyle w:val="NormalTok"/>
+        </w:rPr>
         <w:t xml:space="preserve"> </w:t>
       </w:r>
       <w:r>
-        <w:t xml:space="preserve">python -m src.improved_model</w:t>
+        <w:rPr>
+          <w:rStyle w:val="AttributeTok"/>
+        </w:rPr>
+        <w:t xml:space="preserve">-m</w:t>
       </w:r>
       <w:r>
+        <w:rPr>
+          <w:rStyle w:val="NormalTok"/>
+        </w:rPr>
+        <w:t xml:space="preserve"> src.improved_model</w:t>
+      </w:r>
+      <w:r>
+        <w:br/>
+      </w:r>
+      <w:r>
+        <w:rPr>
+          <w:rStyle w:val="ExtensionTok"/>
+        </w:rPr>
+        <w:t xml:space="preserve">python</w:t>
+      </w:r>
+      <w:r>
+        <w:rPr>
+          <w:rStyle w:val="NormalTok"/>
+        </w:rPr>
         <w:t xml:space="preserve"> </w:t>
       </w:r>
       <w:r>
-        <w:t xml:space="preserve">python -m scripts.plot_report_figures</w:t>
+        <w:rPr>
+          <w:rStyle w:val="AttributeTok"/>
+        </w:rPr>
+        <w:t xml:space="preserve">-m</w:t>
       </w:r>
       <w:r>
+        <w:rPr>
+          <w:rStyle w:val="NormalTok"/>
+        </w:rPr>
+        <w:t xml:space="preserve"> scripts.plot_report_figures</w:t>
+      </w:r>
+      <w:r>
+        <w:br/>
+      </w:r>
+      <w:r>
+        <w:rPr>
+          <w:rStyle w:val="ExtensionTok"/>
+        </w:rPr>
+        <w:t xml:space="preserve">python</w:t>
+      </w:r>
+      <w:r>
+        <w:rPr>
+          <w:rStyle w:val="NormalTok"/>
+        </w:rPr>
         <w:t xml:space="preserve"> </w:t>
       </w:r>
       <w:r>
-        <w:t xml:space="preserve">python -m unittest discover -s tests -v</w:t>
+        <w:rPr>
+          <w:rStyle w:val="AttributeTok"/>
+        </w:rPr>
+        <w:t xml:space="preserve">-m</w:t>
       </w:r>
       <w:r>
-        <w:t xml:space="preserve"> </w:t>
+        <w:rPr>
+          <w:rStyle w:val="NormalTok"/>
+        </w:rPr>
+        <w:t xml:space="preserve"> unittest discover </w:t>
       </w:r>
       <w:r>
-        <w:t xml:space="preserve">```</w:t>
+        <w:rPr>
+          <w:rStyle w:val="AttributeTok"/>
+        </w:rPr>
+        <w:t xml:space="preserve">-s</w:t>
+      </w:r>
+      <w:r>
+        <w:rPr>
+          <w:rStyle w:val="NormalTok"/>
+        </w:rPr>
+        <w:t xml:space="preserve"> tests </w:t>
+      </w:r>
+      <w:r>
+        <w:rPr>
+          <w:rStyle w:val="AttributeTok"/>
+        </w:rPr>
+        <w:t xml:space="preserve">-v</w:t>
       </w:r>
     </w:p>
     <w:p>
       <w:pPr>
-        <w:pStyle w:val="BodyText"/>
+        <w:pStyle w:val="FirstParagraph"/>
       </w:pPr>
       <w:r>
         <w:t xml:space="preserve">실제 데이터를 확인하고 모델을 재학습하면 그래프와 평가 지표를 다시 만들 수 있다. 단일 연도 내 날짜별 분할이라는 한계는 그대로이며 다음 해 예측으로 해석하지 않는다.</w:t>

</xml_diff>